<commit_message>
feat: revisi relevansi bab 2
</commit_message>
<xml_diff>
--- a/bab2/Proposal-IF4091-Capstone-Individu-2026_Draft-Bab2_Editorial.docx
+++ b/bab2/Proposal-IF4091-Capstone-Individu-2026_Draft-Bab2_Editorial.docx
@@ -7934,20 +7934,20 @@
         <w:rPr>
           <w:lang w:val="id-ID"/>
         </w:rPr>
-        <w:t xml:space="preserve"> tanpa graf. Manfaat RAG pada audit dokumentasi rawat inap kebidanan dan anak, serta manfaat KG bila diklaim sebagai bagian dari kontribusi, karena itu perlu diuji dengan membandingkan konfigurasi dengan dan tanpa komponen tersebut </w:t>
+        <w:t xml:space="preserve"> tanpa graf. Karena itu, manfaat RAG pada audit dokumentasi rawat inap kebidanan dan anak perlu diuji terhadap pembanding yang ditetapkan sebelum eksperimen </w:t>
       </w:r>
       <w:r>
         <w:rPr>
           <w:highlight w:val="yellow"/>
           <w:lang w:val="id-ID"/>
         </w:rPr>
-        <w:t xml:space="preserve">[SESUAIKAN DENGAN BAB I: rumusan pertanyaan dan ukuran keberhasilan; fungsi KG pada sistem]</w:t>
-      </w:r>
-      <w:r>
-        <w:rPr>
-          <w:lang w:val="id-ID"/>
-        </w:rPr>
-        <w:t xml:space="preserve">.</w:t>
+        <w:t xml:space="preserve">[SESUAIKAN DENGAN BAB I: rumusan pertanyaan dan ukuran keberhasilan; celah keempat hanya terjawab bila konfigurasi aturan + LLM tanpa retrieval ikut dijalankan, padahal Breakdown menjadikannya opsional]</w:t>
+      </w:r>
+      <w:r>
+        <w:rPr>
+          <w:lang w:val="id-ID"/>
+        </w:rPr>
+        <w:t xml:space="preserve">. Dalam penelitian ini, KG berkedudukan sebagai calon pendekatan pendukung, bukan komponen inti, karena manfaatnya untuk pemeriksaan antardokumen belum ditunjukkan, penyelesaian KG oleh LLM di bidang kesehatan memerlukan validasi pakar klinis (Syeda &amp; Reddy, 2026, hlm. 18), dan cakupan graf yang kurang dapat membuat penalaran yang berisiko lolos tanpa ditandai (Sun dkk., 2027, hlm. 15). Pemakaian KG diputuskan melalui uji kelayakan, dan manfaatnya baru diklaim bila konfigurasi dengan graf telah dibandingkan dengan konfigurasi tanpa graf.</w:t>
       </w:r>
     </w:p>
     <w:p>

</xml_diff>